<commit_message>
Remove invoice refs and use template file
Co-authored-by: Copilot <223556219+Copilot@users.noreply.github.com>
</commit_message>
<xml_diff>
--- a/templates/invoice.docx
+++ b/templates/invoice.docx
@@ -46,116 +46,6 @@
           <w:bCs/>
         </w:rPr>
       </w:pPr>
-      <w:r>
-        <w:rPr>
-          <w:b/>
-          <w:bCs/>
-          <w:noProof/>
-        </w:rPr>
-        <mc:AlternateContent>
-          <mc:Choice Requires="wps">
-            <w:drawing>
-              <wp:anchor distT="0" distB="0" distL="114300" distR="114300" simplePos="0" relativeHeight="251669504" behindDoc="0" locked="0" layoutInCell="1" allowOverlap="1" wp14:anchorId="72A659E0" wp14:editId="2BEF0AD5">
-                <wp:simplePos x="0" y="0"/>
-                <wp:positionH relativeFrom="margin">
-                  <wp:posOffset>381000</wp:posOffset>
-                </wp:positionH>
-                <wp:positionV relativeFrom="paragraph">
-                  <wp:posOffset>176530</wp:posOffset>
-                </wp:positionV>
-                <wp:extent cx="838200" cy="347980"/>
-                <wp:effectExtent l="0" t="0" r="0" b="0"/>
-                <wp:wrapNone/>
-                <wp:docPr id="338146155" name="Text Box 8"/>
-                <wp:cNvGraphicFramePr/>
-                <a:graphic xmlns:a="http://schemas.openxmlformats.org/drawingml/2006/main">
-                  <a:graphicData uri="http://schemas.microsoft.com/office/word/2010/wordprocessingShape">
-                    <wps:wsp>
-                      <wps:cNvSpPr txBox="1"/>
-                      <wps:spPr>
-                        <a:xfrm>
-                          <a:off x="0" y="0"/>
-                          <a:ext cx="838200" cy="347980"/>
-                        </a:xfrm>
-                        <a:prstGeom prst="rect">
-                          <a:avLst/>
-                        </a:prstGeom>
-                        <a:solidFill>
-                          <a:schemeClr val="bg1"/>
-                        </a:solidFill>
-                        <a:ln w="6350">
-                          <a:noFill/>
-                        </a:ln>
-                      </wps:spPr>
-                      <wps:txbx>
-                        <w:txbxContent>
-                          <w:p>
-                            <w:pPr>
-                              <w:rPr>
-                                <w:b/>
-                                <w:bCs/>
-                              </w:rPr>
-                            </w:pPr>
-                            <w:r>
-                              <w:rPr>
-                                <w:b/>
-                                <w:bCs/>
-                              </w:rPr>
-                              <w:t>{{REF}}</w:t>
-                            </w:r>
-                          </w:p>
-                        </w:txbxContent>
-                      </wps:txbx>
-                      <wps:bodyPr rot="0" spcFirstLastPara="0" vertOverflow="overflow" horzOverflow="overflow" vert="horz" wrap="square" lIns="91440" tIns="45720" rIns="91440" bIns="45720" numCol="1" spcCol="0" rtlCol="0" fromWordArt="0" anchor="t" anchorCtr="0" forceAA="0" compatLnSpc="1">
-                        <a:prstTxWarp prst="textNoShape">
-                          <a:avLst/>
-                        </a:prstTxWarp>
-                        <a:noAutofit/>
-                      </wps:bodyPr>
-                    </wps:wsp>
-                  </a:graphicData>
-                </a:graphic>
-                <wp14:sizeRelH relativeFrom="margin">
-                  <wp14:pctWidth>0</wp14:pctWidth>
-                </wp14:sizeRelH>
-                <wp14:sizeRelV relativeFrom="margin">
-                  <wp14:pctHeight>0</wp14:pctHeight>
-                </wp14:sizeRelV>
-              </wp:anchor>
-            </w:drawing>
-          </mc:Choice>
-          <mc:Fallback>
-            <w:pict>
-              <v:shapetype w14:anchorId="72A659E0" id="_x0000_t202" coordsize="21600,21600" o:spt="202" path="m,l,21600r21600,l21600,xe">
-                <v:stroke joinstyle="miter"/>
-                <v:path gradientshapeok="t" o:connecttype="rect"/>
-              </v:shapetype>
-              <v:shape id="Text Box 8" o:spid="_x0000_s1026" type="#_x0000_t202" style="position:absolute;margin-left:30pt;margin-top:13.9pt;width:66pt;height:27.4pt;z-index:251669504;visibility:visible;mso-wrap-style:square;mso-width-percent:0;mso-height-percent:0;mso-wrap-distance-left:9pt;mso-wrap-distance-top:0;mso-wrap-distance-right:9pt;mso-wrap-distance-bottom:0;mso-position-horizontal:absolute;mso-position-horizontal-relative:margin;mso-position-vertical:absolute;mso-position-vertical-relative:text;mso-width-percent:0;mso-height-percent:0;mso-width-relative:margin;mso-height-relative:margin;v-text-anchor:top" o:gfxdata="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" fillcolor="white [3212]" stroked="f" strokeweight=".5pt">
-                <v:textbox>
-                  <w:txbxContent>
-                    <w:p>
-                      <w:pPr>
-                        <w:rPr>
-                          <w:b/>
-                          <w:bCs/>
-                        </w:rPr>
-                      </w:pPr>
-                      <w:r>
-                        <w:rPr>
-                          <w:b/>
-                          <w:bCs/>
-                        </w:rPr>
-                        <w:t>{{REF}}</w:t>
-                      </w:r>
-                    </w:p>
-                  </w:txbxContent>
-                </v:textbox>
-                <w10:wrap anchorx="margin"/>
-              </v:shape>
-            </w:pict>
-          </mc:Fallback>
-        </mc:AlternateContent>
-      </w:r>
     </w:p>
     <w:p>
       <w:pPr>
@@ -337,7 +227,7 @@
                               <w:rPr>
                                 <w:noProof/>
                               </w:rPr>
-                              <w:t>8/28/2025</w:t>
+                              <w:t>10/17/2026</w:t>
                             </w:r>
                             <w:r>
                               <w:fldChar w:fldCharType="end"/>
@@ -365,7 +255,11 @@
           </mc:Choice>
           <mc:Fallback>
             <w:pict>
-              <v:shape w14:anchorId="3B62DF5B" id="_x0000_s1028" type="#_x0000_t202" style="position:absolute;margin-left:1531.9pt;margin-top:43.75pt;width:66pt;height:27.4pt;z-index:251663360;visibility:visible;mso-wrap-style:square;mso-width-percent:0;mso-height-percent:0;mso-wrap-distance-left:9pt;mso-wrap-distance-top:0;mso-wrap-distance-right:9pt;mso-wrap-distance-bottom:0;mso-position-horizontal:absolute;mso-position-horizontal-relative:text;mso-position-vertical:absolute;mso-position-vertical-relative:text;mso-width-percent:0;mso-height-percent:0;mso-width-relative:margin;mso-height-relative:margin;v-text-anchor:top" o:gfxdata="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" fillcolor="white [3212]" stroked="f" strokeweight=".5pt">
+              <v:shapetype w14:anchorId="3B62DF5B" id="_x0000_t202" coordsize="21600,21600" o:spt="202" path="m,l,21600r21600,l21600,xe">
+                <v:stroke joinstyle="miter"/>
+                <v:path gradientshapeok="t" o:connecttype="rect"/>
+              </v:shapetype>
+              <v:shape id="_x0000_s1027" type="#_x0000_t202" style="position:absolute;margin-left:1531.9pt;margin-top:43.75pt;width:66pt;height:27.4pt;z-index:251663360;visibility:visible;mso-wrap-style:square;mso-width-percent:0;mso-height-percent:0;mso-wrap-distance-left:9pt;mso-wrap-distance-top:0;mso-wrap-distance-right:9pt;mso-wrap-distance-bottom:0;mso-position-horizontal:absolute;mso-position-horizontal-relative:text;mso-position-vertical:absolute;mso-position-vertical-relative:text;mso-width-percent:0;mso-height-percent:0;mso-width-relative:margin;mso-height-relative:margin;v-text-anchor:top" o:gfxdata="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" fillcolor="white [3212]" stroked="f" strokeweight=".5pt">
                 <v:textbox>
                   <w:txbxContent>
                     <w:p>
@@ -382,7 +276,7 @@
                         <w:rPr>
                           <w:noProof/>
                         </w:rPr>
-                        <w:t>8/28/2025</w:t>
+                        <w:t>10/17/2026</w:t>
                       </w:r>
                       <w:r>
                         <w:fldChar w:fldCharType="end"/>
@@ -548,35 +442,6 @@
                 <w:bCs/>
               </w:rPr>
             </w:pPr>
-            <w:r>
-              <w:rPr>
-                <w:rFonts w:ascii="Arial" w:eastAsia="Arial" w:hAnsi="Arial" w:cs="Arial"/>
-                <w:b/>
-                <w:bCs/>
-                <w:color w:val="1F1917"/>
-                <w:sz w:val="19"/>
-              </w:rPr>
-              <w:t>0300-4667555</w:t>
-            </w:r>
-          </w:p>
-          <w:p>
-            <w:pPr>
-              <w:ind w:left="78"/>
-              <w:rPr>
-                <w:b/>
-                <w:bCs/>
-              </w:rPr>
-            </w:pPr>
-            <w:r>
-              <w:rPr>
-                <w:rFonts w:ascii="Arial" w:eastAsia="Arial" w:hAnsi="Arial" w:cs="Arial"/>
-                <w:b/>
-                <w:bCs/>
-                <w:color w:val="1F1917"/>
-                <w:sz w:val="19"/>
-              </w:rPr>
-              <w:t>0343-8666868</w:t>
-            </w:r>
           </w:p>
         </w:tc>
         <w:tc>
@@ -2947,112 +2812,6 @@
           </mc:Fallback>
         </mc:AlternateContent>
       </w:r>
-      <w:r>
-        <w:rPr>
-          <w:b/>
-          <w:bCs/>
-          <w:noProof/>
-        </w:rPr>
-        <mc:AlternateContent>
-          <mc:Choice Requires="wps">
-            <w:drawing>
-              <wp:anchor distT="0" distB="0" distL="114300" distR="114300" simplePos="0" relativeHeight="251672576" behindDoc="0" locked="0" layoutInCell="1" allowOverlap="1" wp14:anchorId="2B139CA0" wp14:editId="0F3E2D0B">
-                <wp:simplePos x="0" y="0"/>
-                <wp:positionH relativeFrom="margin">
-                  <wp:posOffset>307975</wp:posOffset>
-                </wp:positionH>
-                <wp:positionV relativeFrom="paragraph">
-                  <wp:posOffset>116840</wp:posOffset>
-                </wp:positionV>
-                <wp:extent cx="838200" cy="347980"/>
-                <wp:effectExtent l="0" t="0" r="0" b="0"/>
-                <wp:wrapNone/>
-                <wp:docPr id="1314968785" name="Text Box 8"/>
-                <wp:cNvGraphicFramePr/>
-                <a:graphic xmlns:a="http://schemas.openxmlformats.org/drawingml/2006/main">
-                  <a:graphicData uri="http://schemas.microsoft.com/office/word/2010/wordprocessingShape">
-                    <wps:wsp>
-                      <wps:cNvSpPr txBox="1"/>
-                      <wps:spPr>
-                        <a:xfrm>
-                          <a:off x="0" y="0"/>
-                          <a:ext cx="838200" cy="347980"/>
-                        </a:xfrm>
-                        <a:prstGeom prst="rect">
-                          <a:avLst/>
-                        </a:prstGeom>
-                        <a:solidFill>
-                          <a:schemeClr val="bg1"/>
-                        </a:solidFill>
-                        <a:ln w="6350">
-                          <a:noFill/>
-                        </a:ln>
-                      </wps:spPr>
-                      <wps:txbx>
-                        <w:txbxContent>
-                          <w:p>
-                            <w:pPr>
-                              <w:rPr>
-                                <w:b/>
-                                <w:bCs/>
-                              </w:rPr>
-                            </w:pPr>
-                            <w:r>
-                              <w:rPr>
-                                <w:b/>
-                                <w:bCs/>
-                              </w:rPr>
-                              <w:t>{{REF}}</w:t>
-                            </w:r>
-                          </w:p>
-                        </w:txbxContent>
-                      </wps:txbx>
-                      <wps:bodyPr rot="0" spcFirstLastPara="0" vertOverflow="overflow" horzOverflow="overflow" vert="horz" wrap="square" lIns="91440" tIns="45720" rIns="91440" bIns="45720" numCol="1" spcCol="0" rtlCol="0" fromWordArt="0" anchor="t" anchorCtr="0" forceAA="0" compatLnSpc="1">
-                        <a:prstTxWarp prst="textNoShape">
-                          <a:avLst/>
-                        </a:prstTxWarp>
-                        <a:noAutofit/>
-                      </wps:bodyPr>
-                    </wps:wsp>
-                  </a:graphicData>
-                </a:graphic>
-                <wp14:sizeRelH relativeFrom="margin">
-                  <wp14:pctWidth>0</wp14:pctWidth>
-                </wp14:sizeRelH>
-                <wp14:sizeRelV relativeFrom="margin">
-                  <wp14:pctHeight>0</wp14:pctHeight>
-                </wp14:sizeRelV>
-              </wp:anchor>
-            </w:drawing>
-          </mc:Choice>
-          <mc:Fallback>
-            <w:pict>
-              <v:shape w14:anchorId="2B139CA0" id="_x0000_s1030" type="#_x0000_t202" style="position:absolute;margin-left:24.25pt;margin-top:9.2pt;width:66pt;height:27.4pt;z-index:251672576;visibility:visible;mso-wrap-style:square;mso-width-percent:0;mso-height-percent:0;mso-wrap-distance-left:9pt;mso-wrap-distance-top:0;mso-wrap-distance-right:9pt;mso-wrap-distance-bottom:0;mso-position-horizontal:absolute;mso-position-horizontal-relative:margin;mso-position-vertical:absolute;mso-position-vertical-relative:text;mso-width-percent:0;mso-height-percent:0;mso-width-relative:margin;mso-height-relative:margin;v-text-anchor:top" o:gfxdata="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" fillcolor="white [3212]" stroked="f" strokeweight=".5pt">
-                <v:textbox>
-                  <w:txbxContent>
-                    <w:p>
-                      <w:pPr>
-                        <w:rPr>
-                          <w:b/>
-                          <w:bCs/>
-                        </w:rPr>
-                      </w:pPr>
-                      <w:r>
-                        <w:rPr>
-                          <w:b/>
-                          <w:bCs/>
-                        </w:rPr>
-                        <w:t>{{REF}}</w:t>
-                      </w:r>
-                    </w:p>
-                  </w:txbxContent>
-                </v:textbox>
-                <w10:wrap anchorx="margin"/>
-              </v:shape>
-            </w:pict>
-          </mc:Fallback>
-        </mc:AlternateContent>
-      </w:r>
     </w:p>
     <w:p>
       <w:pPr>
@@ -3212,35 +2971,6 @@
                 <w:bCs/>
               </w:rPr>
             </w:pPr>
-            <w:r>
-              <w:rPr>
-                <w:rFonts w:ascii="Arial" w:eastAsia="Arial" w:hAnsi="Arial" w:cs="Arial"/>
-                <w:b/>
-                <w:bCs/>
-                <w:color w:val="1F1917"/>
-                <w:sz w:val="19"/>
-              </w:rPr>
-              <w:t>0300-4667555</w:t>
-            </w:r>
-          </w:p>
-          <w:p>
-            <w:pPr>
-              <w:ind w:left="39"/>
-              <w:rPr>
-                <w:b/>
-                <w:bCs/>
-              </w:rPr>
-            </w:pPr>
-            <w:r>
-              <w:rPr>
-                <w:rFonts w:ascii="Arial" w:eastAsia="Arial" w:hAnsi="Arial" w:cs="Arial"/>
-                <w:b/>
-                <w:bCs/>
-                <w:color w:val="1F1917"/>
-                <w:sz w:val="19"/>
-              </w:rPr>
-              <w:t>0343-8666868</w:t>
-            </w:r>
           </w:p>
         </w:tc>
         <w:tc>

</xml_diff>